<commit_message>
Added meeting notes for 22nd October
</commit_message>
<xml_diff>
--- a/Meeting Notes COMP5047.docx
+++ b/Meeting Notes COMP5047.docx
@@ -48,6 +48,20 @@
         </w:rPr>
         <w:t xml:space="preserve"> Oct</w:t>
       </w:r>
+      <w:r>
+        <w:rPr>
+          <w:b/>
+          <w:bCs/>
+        </w:rPr>
+        <w:t xml:space="preserve"> – 1</w:t>
+      </w:r>
+      <w:r>
+        <w:rPr>
+          <w:b/>
+          <w:bCs/>
+        </w:rPr>
+        <w:t xml:space="preserve">3:00 Meeting 2 </w:t>
+      </w:r>
     </w:p>
     <w:p>
       <w:r>
@@ -59,7 +73,7 @@
         <w:pStyle w:val="ListParagraph"/>
         <w:numPr>
           <w:ilvl w:val="0"/>
-          <w:numId w:val="1"/>
+          <w:numId w:val="2"/>
         </w:numPr>
       </w:pPr>
       <w:r>
@@ -74,7 +88,7 @@
         <w:pStyle w:val="ListParagraph"/>
         <w:numPr>
           <w:ilvl w:val="0"/>
-          <w:numId w:val="1"/>
+          <w:numId w:val="2"/>
         </w:numPr>
       </w:pPr>
       <w:r>
@@ -86,7 +100,7 @@
         <w:pStyle w:val="ListParagraph"/>
         <w:numPr>
           <w:ilvl w:val="0"/>
-          <w:numId w:val="1"/>
+          <w:numId w:val="2"/>
         </w:numPr>
       </w:pPr>
       <w:r>
@@ -98,7 +112,7 @@
         <w:pStyle w:val="ListParagraph"/>
         <w:numPr>
           <w:ilvl w:val="0"/>
-          <w:numId w:val="1"/>
+          <w:numId w:val="2"/>
         </w:numPr>
       </w:pPr>
       <w:r>
@@ -110,13 +124,346 @@
         <w:pStyle w:val="ListParagraph"/>
         <w:numPr>
           <w:ilvl w:val="0"/>
-          <w:numId w:val="1"/>
+          <w:numId w:val="2"/>
         </w:numPr>
       </w:pPr>
       <w:r>
         <w:t>Plan future meetings</w:t>
       </w:r>
     </w:p>
+    <w:p>
+      <w:r>
+        <w:t>Notes:</w:t>
+      </w:r>
+    </w:p>
+    <w:p>
+      <w:r>
+        <w:t xml:space="preserve">Attendance: </w:t>
+      </w:r>
+      <w:r>
+        <w:t>Alex, Jack, Rayyan, Andrea (</w:t>
+      </w:r>
+      <w:r>
+        <w:t xml:space="preserve">slightly </w:t>
+      </w:r>
+      <w:r>
+        <w:t>delayed due to</w:t>
+      </w:r>
+      <w:r>
+        <w:t xml:space="preserve"> unforeseen </w:t>
+      </w:r>
+      <w:r>
+        <w:t>delays at her job</w:t>
+      </w:r>
+      <w:r>
+        <w:t>)</w:t>
+      </w:r>
+    </w:p>
+    <w:p>
+      <w:r>
+        <w:t>1</w:t>
+      </w:r>
+      <w:r>
+        <w:t xml:space="preserve"> - </w:t>
+      </w:r>
+      <w:proofErr w:type="spellStart"/>
+      <w:r>
+        <w:t>Progess</w:t>
+      </w:r>
+      <w:proofErr w:type="spellEnd"/>
+      <w:r>
+        <w:t>:</w:t>
+      </w:r>
+    </w:p>
+    <w:tbl>
+      <w:tblPr>
+        <w:tblStyle w:val="TableGrid"/>
+        <w:tblW w:w="0" w:type="auto"/>
+        <w:tblLook w:val="04A0" w:firstRow="1" w:lastRow="0" w:firstColumn="1" w:lastColumn="0" w:noHBand="0" w:noVBand="1"/>
+      </w:tblPr>
+      <w:tblGrid>
+        <w:gridCol w:w="2254"/>
+        <w:gridCol w:w="2254"/>
+        <w:gridCol w:w="2254"/>
+        <w:gridCol w:w="2254"/>
+      </w:tblGrid>
+      <w:tr>
+        <w:tc>
+          <w:tcPr>
+            <w:tcW w:w="2254" w:type="dxa"/>
+          </w:tcPr>
+          <w:p>
+            <w:r>
+              <w:t>Student</w:t>
+            </w:r>
+          </w:p>
+        </w:tc>
+        <w:tc>
+          <w:tcPr>
+            <w:tcW w:w="2254" w:type="dxa"/>
+          </w:tcPr>
+          <w:p>
+            <w:r>
+              <w:t>Warden</w:t>
+            </w:r>
+          </w:p>
+        </w:tc>
+        <w:tc>
+          <w:tcPr>
+            <w:tcW w:w="2254" w:type="dxa"/>
+          </w:tcPr>
+          <w:p>
+            <w:r>
+              <w:t>Accommodation</w:t>
+            </w:r>
+          </w:p>
+        </w:tc>
+        <w:tc>
+          <w:tcPr>
+            <w:tcW w:w="2254" w:type="dxa"/>
+          </w:tcPr>
+          <w:p>
+            <w:r>
+              <w:t>Operator System</w:t>
+            </w:r>
+          </w:p>
+        </w:tc>
+      </w:tr>
+      <w:tr>
+        <w:tc>
+          <w:tcPr>
+            <w:tcW w:w="2254" w:type="dxa"/>
+          </w:tcPr>
+          <w:p>
+            <w:r>
+              <w:t>Halfway through task 2, uploading files to repository today</w:t>
+            </w:r>
+            <w:r>
+              <w:t>.</w:t>
+            </w:r>
+          </w:p>
+        </w:tc>
+        <w:tc>
+          <w:tcPr>
+            <w:tcW w:w="2254" w:type="dxa"/>
+          </w:tcPr>
+          <w:p>
+            <w:r>
+              <w:t>…</w:t>
+            </w:r>
+          </w:p>
+        </w:tc>
+        <w:tc>
+          <w:tcPr>
+            <w:tcW w:w="2254" w:type="dxa"/>
+          </w:tcPr>
+          <w:p>
+            <w:r>
+              <w:t xml:space="preserve">Progress </w:t>
+            </w:r>
+            <w:r>
+              <w:t xml:space="preserve">slowed </w:t>
+            </w:r>
+            <w:r>
+              <w:t xml:space="preserve">due to </w:t>
+            </w:r>
+            <w:r>
+              <w:t>heavy workload. Time cleared out this week to catch up.</w:t>
+            </w:r>
+          </w:p>
+          <w:p>
+            <w:r>
+              <w:t xml:space="preserve">No files yet uploaded </w:t>
+            </w:r>
+            <w:r>
+              <w:t xml:space="preserve">due to </w:t>
+            </w:r>
+            <w:r>
+              <w:t>lack</w:t>
+            </w:r>
+            <w:r>
+              <w:t xml:space="preserve"> </w:t>
+            </w:r>
+            <w:r>
+              <w:t xml:space="preserve">of </w:t>
+            </w:r>
+            <w:r>
+              <w:t xml:space="preserve">access to </w:t>
+            </w:r>
+            <w:r>
+              <w:t xml:space="preserve">the group </w:t>
+            </w:r>
+            <w:r>
+              <w:t>GitHub</w:t>
+            </w:r>
+            <w:r>
+              <w:t xml:space="preserve"> repository</w:t>
+            </w:r>
+            <w:r>
+              <w:t>.</w:t>
+            </w:r>
+          </w:p>
+        </w:tc>
+        <w:tc>
+          <w:tcPr>
+            <w:tcW w:w="2254" w:type="dxa"/>
+          </w:tcPr>
+          <w:p>
+            <w:r>
+              <w:t>Task 2</w:t>
+            </w:r>
+            <w:r>
+              <w:t xml:space="preserve"> use case diagram complete</w:t>
+            </w:r>
+            <w:r>
+              <w:t xml:space="preserve"> and on GitHub</w:t>
+            </w:r>
+            <w:r>
+              <w:t>, activity diagram in progress, quality requirements</w:t>
+            </w:r>
+            <w:r>
+              <w:t xml:space="preserve"> on GitHub, but</w:t>
+            </w:r>
+            <w:r>
+              <w:t xml:space="preserve"> need adjusting. </w:t>
+            </w:r>
+          </w:p>
+        </w:tc>
+      </w:tr>
+    </w:tbl>
+    <w:p/>
+    <w:p>
+      <w:r>
+        <w:t>2</w:t>
+      </w:r>
+      <w:r>
+        <w:t xml:space="preserve"> - </w:t>
+      </w:r>
+      <w:r>
+        <w:t>Compatibility</w:t>
+      </w:r>
+      <w:r>
+        <w:t xml:space="preserve">: </w:t>
+      </w:r>
+    </w:p>
+    <w:p>
+      <w:r>
+        <w:t xml:space="preserve">We agreed that at this point in the project, our work is fairly separate. </w:t>
+      </w:r>
+      <w:r>
+        <w:t>No conflicts between our work observed.</w:t>
+      </w:r>
+    </w:p>
+    <w:p>
+      <w:r>
+        <w:t>3</w:t>
+      </w:r>
+      <w:r>
+        <w:t xml:space="preserve"> - GitHub</w:t>
+      </w:r>
+      <w:r>
+        <w:t>:</w:t>
+      </w:r>
+    </w:p>
+    <w:p>
+      <w:r>
+        <w:t>One member lacked access to GitHub, two had access, but had not yet uploaded their files to GitHub</w:t>
+      </w:r>
+      <w:r>
+        <w:t xml:space="preserve">. We agreed </w:t>
+      </w:r>
+      <w:r>
+        <w:t xml:space="preserve">to attempt to sort out GitHub access for the former and that the latter would upload some files to GitHub </w:t>
+      </w:r>
+      <w:r>
+        <w:t>after</w:t>
+      </w:r>
+      <w:r>
+        <w:t xml:space="preserve"> this meeting.</w:t>
+      </w:r>
+    </w:p>
+    <w:p>
+      <w:r>
+        <w:t>4</w:t>
+      </w:r>
+      <w:r>
+        <w:t xml:space="preserve"> – Next Steps</w:t>
+      </w:r>
+      <w:r>
+        <w:t>:</w:t>
+      </w:r>
+    </w:p>
+    <w:p>
+      <w:r>
+        <w:t xml:space="preserve">Complete tasks 2 and 3, </w:t>
+      </w:r>
+    </w:p>
+    <w:p>
+      <w:r>
+        <w:lastRenderedPageBreak/>
+        <w:t>Sort out GitHub</w:t>
+      </w:r>
+      <w:r>
+        <w:t xml:space="preserve"> repository</w:t>
+      </w:r>
+      <w:r>
+        <w:t xml:space="preserve"> access,</w:t>
+      </w:r>
+    </w:p>
+    <w:p>
+      <w:r>
+        <w:t>Upload more files to GitHub</w:t>
+      </w:r>
+      <w:r>
+        <w:t>,</w:t>
+      </w:r>
+    </w:p>
+    <w:p>
+      <w:r>
+        <w:t>5 – Plan future meetings</w:t>
+      </w:r>
+      <w:r>
+        <w:t>:</w:t>
+      </w:r>
+    </w:p>
+    <w:p>
+      <w:r>
+        <w:t xml:space="preserve">We agreed to meet weekly on </w:t>
+      </w:r>
+      <w:r>
+        <w:t>Thursdays from now on.</w:t>
+      </w:r>
+    </w:p>
+    <w:p>
+      <w:r>
+        <w:t>We agreed to meet slightly later</w:t>
+      </w:r>
+      <w:r>
+        <w:t xml:space="preserve"> in the day at </w:t>
+      </w:r>
+      <w:r>
+        <w:t>14</w:t>
+      </w:r>
+      <w:r>
+        <w:t>:</w:t>
+      </w:r>
+      <w:r>
+        <w:t>00</w:t>
+      </w:r>
+      <w:r>
+        <w:t xml:space="preserve"> to better fit around Andre</w:t>
+      </w:r>
+      <w:r>
+        <w:t>e</w:t>
+      </w:r>
+      <w:r>
+        <w:t xml:space="preserve">a’s  </w:t>
+      </w:r>
+      <w:r>
+        <w:t>work schedule.</w:t>
+      </w:r>
+    </w:p>
+    <w:p/>
     <w:p/>
     <w:sectPr>
       <w:pgSz w:w="11906" w:h="16838"/>
@@ -131,6 +478,119 @@
 <file path=word/numbering.xml><?xml version="1.0" encoding="utf-8"?>
 <w:numbering xmlns:wpc="http://schemas.microsoft.com/office/word/2010/wordprocessingCanvas" xmlns:cx="http://schemas.microsoft.com/office/drawing/2014/chartex" xmlns:cx1="http://schemas.microsoft.com/office/drawing/2015/9/8/chartex" xmlns:cx2="http://schemas.microsoft.com/office/drawing/2015/10/21/chartex" xmlns:cx3="http://schemas.microsoft.com/office/drawing/2016/5/9/chartex" xmlns:cx4="http://schemas.microsoft.com/office/drawing/2016/5/10/chartex" xmlns:cx5="http://schemas.microsoft.com/office/drawing/2016/5/11/chartex" xmlns:cx6="http://schemas.microsoft.com/office/drawing/2016/5/12/chartex" xmlns:cx7="http://schemas.microsoft.com/office/drawing/2016/5/13/chartex" xmlns:cx8="http://schemas.microsoft.com/office/drawing/2016/5/14/chartex" xmlns:mc="http://schemas.openxmlformats.org/markup-compatibility/2006" xmlns:aink="http://schemas.microsoft.com/office/drawing/2016/ink" xmlns:am3d="http://schemas.microsoft.com/office/drawing/2017/model3d" xmlns:o="urn:schemas-microsoft-com:office:office" xmlns:oel="http://schemas.microsoft.com/office/2019/extlst" xmlns:r="http://schemas.openxmlformats.org/officeDocument/2006/relationships" xmlns:m="http://schemas.openxmlformats.org/officeDocument/2006/math" xmlns:v="urn:schemas-microsoft-com:vml" xmlns:wp14="http://schemas.microsoft.com/office/word/2010/wordprocessingDrawing" xmlns:wp="http://schemas.openxmlformats.org/drawingml/2006/wordprocessingDrawing" xmlns:w10="urn:schemas-microsoft-com:office:word" xmlns:w="http://schemas.openxmlformats.org/wordprocessingml/2006/main" xmlns:w14="http://schemas.microsoft.com/office/word/2010/wordml" xmlns:w15="http://schemas.microsoft.com/office/word/2012/wordml" xmlns:w16cex="http://schemas.microsoft.com/office/word/2018/wordml/cex" xmlns:w16cid="http://schemas.microsoft.com/office/word/2016/wordml/cid" xmlns:w16="http://schemas.microsoft.com/office/word/2018/wordml" xmlns:w16du="http://schemas.microsoft.com/office/word/2023/wordml/word16du" xmlns:w16sdtdh="http://schemas.microsoft.com/office/word/2020/wordml/sdtdatahash" xmlns:w16sdtfl="http://schemas.microsoft.com/office/word/2024/wordml/sdtformatlock" xmlns:w16se="http://schemas.microsoft.com/office/word/2015/wordml/symex" xmlns:wpg="http://schemas.microsoft.com/office/word/2010/wordprocessingGroup" xmlns:wpi="http://schemas.microsoft.com/office/word/2010/wordprocessingInk" xmlns:wne="http://schemas.microsoft.com/office/word/2006/wordml" xmlns:wps="http://schemas.microsoft.com/office/word/2010/wordprocessingShape" mc:Ignorable="w14 w15 w16se w16cid w16 w16cex w16sdtdh w16sdtfl w16du wp14">
   <w:abstractNum w:abstractNumId="0" w15:restartNumberingAfterBreak="0">
+    <w:nsid w:val="38D33ADD"/>
+    <w:multiLevelType w:val="hybridMultilevel"/>
+    <w:tmpl w:val="1876AED4"/>
+    <w:lvl w:ilvl="0" w:tplc="0809000F">
+      <w:start w:val="1"/>
+      <w:numFmt w:val="decimal"/>
+      <w:lvlText w:val="%1."/>
+      <w:lvlJc w:val="left"/>
+      <w:pPr>
+        <w:ind w:left="720" w:hanging="360"/>
+      </w:pPr>
+      <w:rPr>
+        <w:rFonts w:hint="default"/>
+      </w:rPr>
+    </w:lvl>
+    <w:lvl w:ilvl="1" w:tplc="FFFFFFFF" w:tentative="1">
+      <w:start w:val="1"/>
+      <w:numFmt w:val="bullet"/>
+      <w:lvlText w:val="o"/>
+      <w:lvlJc w:val="left"/>
+      <w:pPr>
+        <w:ind w:left="1440" w:hanging="360"/>
+      </w:pPr>
+      <w:rPr>
+        <w:rFonts w:ascii="Courier New" w:hAnsi="Courier New" w:cs="Courier New" w:hint="default"/>
+      </w:rPr>
+    </w:lvl>
+    <w:lvl w:ilvl="2" w:tplc="FFFFFFFF" w:tentative="1">
+      <w:start w:val="1"/>
+      <w:numFmt w:val="bullet"/>
+      <w:lvlText w:val=""/>
+      <w:lvlJc w:val="left"/>
+      <w:pPr>
+        <w:ind w:left="2160" w:hanging="360"/>
+      </w:pPr>
+      <w:rPr>
+        <w:rFonts w:ascii="Wingdings" w:hAnsi="Wingdings" w:hint="default"/>
+      </w:rPr>
+    </w:lvl>
+    <w:lvl w:ilvl="3" w:tplc="FFFFFFFF" w:tentative="1">
+      <w:start w:val="1"/>
+      <w:numFmt w:val="bullet"/>
+      <w:lvlText w:val=""/>
+      <w:lvlJc w:val="left"/>
+      <w:pPr>
+        <w:ind w:left="2880" w:hanging="360"/>
+      </w:pPr>
+      <w:rPr>
+        <w:rFonts w:ascii="Symbol" w:hAnsi="Symbol" w:hint="default"/>
+      </w:rPr>
+    </w:lvl>
+    <w:lvl w:ilvl="4" w:tplc="FFFFFFFF" w:tentative="1">
+      <w:start w:val="1"/>
+      <w:numFmt w:val="bullet"/>
+      <w:lvlText w:val="o"/>
+      <w:lvlJc w:val="left"/>
+      <w:pPr>
+        <w:ind w:left="3600" w:hanging="360"/>
+      </w:pPr>
+      <w:rPr>
+        <w:rFonts w:ascii="Courier New" w:hAnsi="Courier New" w:cs="Courier New" w:hint="default"/>
+      </w:rPr>
+    </w:lvl>
+    <w:lvl w:ilvl="5" w:tplc="FFFFFFFF" w:tentative="1">
+      <w:start w:val="1"/>
+      <w:numFmt w:val="bullet"/>
+      <w:lvlText w:val=""/>
+      <w:lvlJc w:val="left"/>
+      <w:pPr>
+        <w:ind w:left="4320" w:hanging="360"/>
+      </w:pPr>
+      <w:rPr>
+        <w:rFonts w:ascii="Wingdings" w:hAnsi="Wingdings" w:hint="default"/>
+      </w:rPr>
+    </w:lvl>
+    <w:lvl w:ilvl="6" w:tplc="FFFFFFFF" w:tentative="1">
+      <w:start w:val="1"/>
+      <w:numFmt w:val="bullet"/>
+      <w:lvlText w:val=""/>
+      <w:lvlJc w:val="left"/>
+      <w:pPr>
+        <w:ind w:left="5040" w:hanging="360"/>
+      </w:pPr>
+      <w:rPr>
+        <w:rFonts w:ascii="Symbol" w:hAnsi="Symbol" w:hint="default"/>
+      </w:rPr>
+    </w:lvl>
+    <w:lvl w:ilvl="7" w:tplc="FFFFFFFF" w:tentative="1">
+      <w:start w:val="1"/>
+      <w:numFmt w:val="bullet"/>
+      <w:lvlText w:val="o"/>
+      <w:lvlJc w:val="left"/>
+      <w:pPr>
+        <w:ind w:left="5760" w:hanging="360"/>
+      </w:pPr>
+      <w:rPr>
+        <w:rFonts w:ascii="Courier New" w:hAnsi="Courier New" w:cs="Courier New" w:hint="default"/>
+      </w:rPr>
+    </w:lvl>
+    <w:lvl w:ilvl="8" w:tplc="FFFFFFFF" w:tentative="1">
+      <w:start w:val="1"/>
+      <w:numFmt w:val="bullet"/>
+      <w:lvlText w:val=""/>
+      <w:lvlJc w:val="left"/>
+      <w:pPr>
+        <w:ind w:left="6480" w:hanging="360"/>
+      </w:pPr>
+      <w:rPr>
+        <w:rFonts w:ascii="Wingdings" w:hAnsi="Wingdings" w:hint="default"/>
+      </w:rPr>
+    </w:lvl>
+  </w:abstractNum>
+  <w:abstractNum w:abstractNumId="1" w15:restartNumberingAfterBreak="0">
     <w:nsid w:val="712E345F"/>
     <w:multiLevelType w:val="hybridMultilevel"/>
     <w:tmpl w:val="DEC82658"/>
@@ -244,6 +704,9 @@
     </w:lvl>
   </w:abstractNum>
   <w:num w:numId="1" w16cid:durableId="1110664871">
+    <w:abstractNumId w:val="1"/>
+  </w:num>
+  <w:num w:numId="2" w16cid:durableId="2028285801">
     <w:abstractNumId w:val="0"/>
   </w:num>
 </w:numbering>
@@ -1166,6 +1629,25 @@
       <w:spacing w:val="5"/>
     </w:rPr>
   </w:style>
+  <w:style w:type="table" w:styleId="TableGrid">
+    <w:name w:val="Table Grid"/>
+    <w:basedOn w:val="TableNormal"/>
+    <w:uiPriority w:val="39"/>
+    <w:rsid w:val="00D40ADB"/>
+    <w:pPr>
+      <w:spacing w:after="0" w:line="240" w:lineRule="auto"/>
+    </w:pPr>
+    <w:tblPr>
+      <w:tblBorders>
+        <w:top w:val="single" w:sz="4" w:space="0" w:color="auto"/>
+        <w:left w:val="single" w:sz="4" w:space="0" w:color="auto"/>
+        <w:bottom w:val="single" w:sz="4" w:space="0" w:color="auto"/>
+        <w:right w:val="single" w:sz="4" w:space="0" w:color="auto"/>
+        <w:insideH w:val="single" w:sz="4" w:space="0" w:color="auto"/>
+        <w:insideV w:val="single" w:sz="4" w:space="0" w:color="auto"/>
+      </w:tblBorders>
+    </w:tblPr>
+  </w:style>
 </w:styles>
 </file>
 

</xml_diff>

<commit_message>
Fixed error in meeting notes for 22nd October
</commit_message>
<xml_diff>
--- a/Meeting Notes COMP5047.docx
+++ b/Meeting Notes COMP5047.docx
@@ -249,7 +249,7 @@
           </w:tcPr>
           <w:p>
             <w:r>
-              <w:t>…</w:t>
+              <w:t>Task 2 completed, extensive analysis and notes made.</w:t>
             </w:r>
           </w:p>
         </w:tc>
@@ -348,7 +348,15 @@
     </w:p>
     <w:p>
       <w:r>
-        <w:t xml:space="preserve">We agreed that at this point in the project, our work is fairly separate. </w:t>
+        <w:t xml:space="preserve">We agreed that at this point in the project, our work is </w:t>
+      </w:r>
+      <w:proofErr w:type="gramStart"/>
+      <w:r>
+        <w:t>fairly separate</w:t>
+      </w:r>
+      <w:proofErr w:type="gramEnd"/>
+      <w:r>
+        <w:t xml:space="preserve">. </w:t>
       </w:r>
       <w:r>
         <w:t>No conflicts between our work observed.</w:t>
@@ -451,16 +459,13 @@
         <w:t>00</w:t>
       </w:r>
       <w:r>
-        <w:t xml:space="preserve"> to better fit around Andre</w:t>
-      </w:r>
-      <w:r>
-        <w:t>e</w:t>
-      </w:r>
-      <w:r>
-        <w:t xml:space="preserve">a’s  </w:t>
-      </w:r>
-      <w:r>
-        <w:t>work schedule.</w:t>
+        <w:t xml:space="preserve"> to better fit around </w:t>
+      </w:r>
+      <w:r>
+        <w:t>Andreea’s work</w:t>
+      </w:r>
+      <w:r>
+        <w:t xml:space="preserve"> schedule.</w:t>
       </w:r>
     </w:p>
     <w:p/>

</xml_diff>

<commit_message>
Meeting agenda for 29th October
</commit_message>
<xml_diff>
--- a/Meeting Notes COMP5047.docx
+++ b/Meeting Notes COMP5047.docx
@@ -348,15 +348,7 @@
     </w:p>
     <w:p>
       <w:r>
-        <w:t xml:space="preserve">We agreed that at this point in the project, our work is </w:t>
-      </w:r>
-      <w:proofErr w:type="gramStart"/>
-      <w:r>
-        <w:t>fairly separate</w:t>
-      </w:r>
-      <w:proofErr w:type="gramEnd"/>
-      <w:r>
-        <w:t xml:space="preserve">. </w:t>
+        <w:t xml:space="preserve">We agreed that at this point in the project, our work is fairly separate. </w:t>
       </w:r>
       <w:r>
         <w:t>No conflicts between our work observed.</w:t>
@@ -469,7 +461,129 @@
       </w:r>
     </w:p>
     <w:p/>
-    <w:p/>
+    <w:p>
+      <w:pPr>
+        <w:rPr>
+          <w:b/>
+          <w:bCs/>
+        </w:rPr>
+      </w:pPr>
+      <w:r>
+        <w:rPr>
+          <w:b/>
+          <w:bCs/>
+        </w:rPr>
+        <w:t>2</w:t>
+      </w:r>
+      <w:r>
+        <w:rPr>
+          <w:b/>
+          <w:bCs/>
+        </w:rPr>
+        <w:t>9</w:t>
+      </w:r>
+      <w:r>
+        <w:rPr>
+          <w:b/>
+          <w:bCs/>
+          <w:vertAlign w:val="superscript"/>
+        </w:rPr>
+        <w:t>th</w:t>
+      </w:r>
+      <w:r>
+        <w:rPr>
+          <w:b/>
+          <w:bCs/>
+        </w:rPr>
+        <w:t xml:space="preserve"> Oct</w:t>
+      </w:r>
+      <w:r>
+        <w:rPr>
+          <w:b/>
+          <w:bCs/>
+        </w:rPr>
+        <w:t xml:space="preserve"> – 1</w:t>
+      </w:r>
+      <w:r>
+        <w:rPr>
+          <w:b/>
+          <w:bCs/>
+        </w:rPr>
+        <w:t>4</w:t>
+      </w:r>
+      <w:r>
+        <w:rPr>
+          <w:b/>
+          <w:bCs/>
+        </w:rPr>
+        <w:t xml:space="preserve">:00 Meeting </w:t>
+      </w:r>
+      <w:r>
+        <w:rPr>
+          <w:b/>
+          <w:bCs/>
+        </w:rPr>
+        <w:t>3</w:t>
+      </w:r>
+      <w:r>
+        <w:rPr>
+          <w:b/>
+          <w:bCs/>
+        </w:rPr>
+        <w:t xml:space="preserve"> </w:t>
+      </w:r>
+    </w:p>
+    <w:p>
+      <w:r>
+        <w:t>Agenda:</w:t>
+      </w:r>
+    </w:p>
+    <w:p>
+      <w:pPr>
+        <w:pStyle w:val="ListParagraph"/>
+        <w:numPr>
+          <w:ilvl w:val="0"/>
+          <w:numId w:val="3"/>
+        </w:numPr>
+      </w:pPr>
+      <w:r>
+        <w:t>Determine how far along each member is with their work.</w:t>
+      </w:r>
+    </w:p>
+    <w:p>
+      <w:pPr>
+        <w:pStyle w:val="ListParagraph"/>
+        <w:numPr>
+          <w:ilvl w:val="0"/>
+          <w:numId w:val="3"/>
+        </w:numPr>
+      </w:pPr>
+      <w:r>
+        <w:t>Check on tasks from last week</w:t>
+      </w:r>
+    </w:p>
+    <w:p>
+      <w:pPr>
+        <w:pStyle w:val="ListParagraph"/>
+        <w:numPr>
+          <w:ilvl w:val="0"/>
+          <w:numId w:val="3"/>
+        </w:numPr>
+      </w:pPr>
+      <w:r>
+        <w:t>Discuss next steps</w:t>
+      </w:r>
+    </w:p>
+    <w:p>
+      <w:r>
+        <w:t>Notes:</w:t>
+      </w:r>
+    </w:p>
+    <w:p>
+      <w:r>
+        <w:t>Attendance:</w:t>
+      </w:r>
+    </w:p>
     <w:sectPr>
       <w:pgSz w:w="11906" w:h="16838"/>
       <w:pgMar w:top="1440" w:right="1440" w:bottom="1440" w:left="1440" w:header="708" w:footer="708" w:gutter="0"/>
@@ -596,6 +710,119 @@
     </w:lvl>
   </w:abstractNum>
   <w:abstractNum w:abstractNumId="1" w15:restartNumberingAfterBreak="0">
+    <w:nsid w:val="51627119"/>
+    <w:multiLevelType w:val="hybridMultilevel"/>
+    <w:tmpl w:val="1876AED4"/>
+    <w:lvl w:ilvl="0" w:tplc="FFFFFFFF">
+      <w:start w:val="1"/>
+      <w:numFmt w:val="decimal"/>
+      <w:lvlText w:val="%1."/>
+      <w:lvlJc w:val="left"/>
+      <w:pPr>
+        <w:ind w:left="720" w:hanging="360"/>
+      </w:pPr>
+      <w:rPr>
+        <w:rFonts w:hint="default"/>
+      </w:rPr>
+    </w:lvl>
+    <w:lvl w:ilvl="1" w:tplc="FFFFFFFF" w:tentative="1">
+      <w:start w:val="1"/>
+      <w:numFmt w:val="bullet"/>
+      <w:lvlText w:val="o"/>
+      <w:lvlJc w:val="left"/>
+      <w:pPr>
+        <w:ind w:left="1440" w:hanging="360"/>
+      </w:pPr>
+      <w:rPr>
+        <w:rFonts w:ascii="Courier New" w:hAnsi="Courier New" w:cs="Courier New" w:hint="default"/>
+      </w:rPr>
+    </w:lvl>
+    <w:lvl w:ilvl="2" w:tplc="FFFFFFFF" w:tentative="1">
+      <w:start w:val="1"/>
+      <w:numFmt w:val="bullet"/>
+      <w:lvlText w:val=""/>
+      <w:lvlJc w:val="left"/>
+      <w:pPr>
+        <w:ind w:left="2160" w:hanging="360"/>
+      </w:pPr>
+      <w:rPr>
+        <w:rFonts w:ascii="Wingdings" w:hAnsi="Wingdings" w:hint="default"/>
+      </w:rPr>
+    </w:lvl>
+    <w:lvl w:ilvl="3" w:tplc="FFFFFFFF" w:tentative="1">
+      <w:start w:val="1"/>
+      <w:numFmt w:val="bullet"/>
+      <w:lvlText w:val=""/>
+      <w:lvlJc w:val="left"/>
+      <w:pPr>
+        <w:ind w:left="2880" w:hanging="360"/>
+      </w:pPr>
+      <w:rPr>
+        <w:rFonts w:ascii="Symbol" w:hAnsi="Symbol" w:hint="default"/>
+      </w:rPr>
+    </w:lvl>
+    <w:lvl w:ilvl="4" w:tplc="FFFFFFFF" w:tentative="1">
+      <w:start w:val="1"/>
+      <w:numFmt w:val="bullet"/>
+      <w:lvlText w:val="o"/>
+      <w:lvlJc w:val="left"/>
+      <w:pPr>
+        <w:ind w:left="3600" w:hanging="360"/>
+      </w:pPr>
+      <w:rPr>
+        <w:rFonts w:ascii="Courier New" w:hAnsi="Courier New" w:cs="Courier New" w:hint="default"/>
+      </w:rPr>
+    </w:lvl>
+    <w:lvl w:ilvl="5" w:tplc="FFFFFFFF" w:tentative="1">
+      <w:start w:val="1"/>
+      <w:numFmt w:val="bullet"/>
+      <w:lvlText w:val=""/>
+      <w:lvlJc w:val="left"/>
+      <w:pPr>
+        <w:ind w:left="4320" w:hanging="360"/>
+      </w:pPr>
+      <w:rPr>
+        <w:rFonts w:ascii="Wingdings" w:hAnsi="Wingdings" w:hint="default"/>
+      </w:rPr>
+    </w:lvl>
+    <w:lvl w:ilvl="6" w:tplc="FFFFFFFF" w:tentative="1">
+      <w:start w:val="1"/>
+      <w:numFmt w:val="bullet"/>
+      <w:lvlText w:val=""/>
+      <w:lvlJc w:val="left"/>
+      <w:pPr>
+        <w:ind w:left="5040" w:hanging="360"/>
+      </w:pPr>
+      <w:rPr>
+        <w:rFonts w:ascii="Symbol" w:hAnsi="Symbol" w:hint="default"/>
+      </w:rPr>
+    </w:lvl>
+    <w:lvl w:ilvl="7" w:tplc="FFFFFFFF" w:tentative="1">
+      <w:start w:val="1"/>
+      <w:numFmt w:val="bullet"/>
+      <w:lvlText w:val="o"/>
+      <w:lvlJc w:val="left"/>
+      <w:pPr>
+        <w:ind w:left="5760" w:hanging="360"/>
+      </w:pPr>
+      <w:rPr>
+        <w:rFonts w:ascii="Courier New" w:hAnsi="Courier New" w:cs="Courier New" w:hint="default"/>
+      </w:rPr>
+    </w:lvl>
+    <w:lvl w:ilvl="8" w:tplc="FFFFFFFF" w:tentative="1">
+      <w:start w:val="1"/>
+      <w:numFmt w:val="bullet"/>
+      <w:lvlText w:val=""/>
+      <w:lvlJc w:val="left"/>
+      <w:pPr>
+        <w:ind w:left="6480" w:hanging="360"/>
+      </w:pPr>
+      <w:rPr>
+        <w:rFonts w:ascii="Wingdings" w:hAnsi="Wingdings" w:hint="default"/>
+      </w:rPr>
+    </w:lvl>
+  </w:abstractNum>
+  <w:abstractNum w:abstractNumId="2" w15:restartNumberingAfterBreak="0">
     <w:nsid w:val="712E345F"/>
     <w:multiLevelType w:val="hybridMultilevel"/>
     <w:tmpl w:val="DEC82658"/>
@@ -709,10 +936,13 @@
     </w:lvl>
   </w:abstractNum>
   <w:num w:numId="1" w16cid:durableId="1110664871">
-    <w:abstractNumId w:val="1"/>
+    <w:abstractNumId w:val="2"/>
   </w:num>
   <w:num w:numId="2" w16cid:durableId="2028285801">
     <w:abstractNumId w:val="0"/>
+  </w:num>
+  <w:num w:numId="3" w16cid:durableId="508100786">
+    <w:abstractNumId w:val="1"/>
   </w:num>
 </w:numbering>
 </file>

</xml_diff>